<commit_message>
Iteration 2 Group Submission
</commit_message>
<xml_diff>
--- a/doc/CS673_MeetingMinutes_team2.docx
+++ b/doc/CS673_MeetingMinutes_team2.docx
@@ -174,6 +174,18 @@
     </w:p>
     <w:p>
       <w:pPr>
+        <w:keepNext w:val="0"/>
+        <w:keepLines w:val="0"/>
+        <w:pageBreakBefore w:val="0"/>
+        <w:widowControl w:val="0"/>
+        <w:pBdr>
+          <w:top w:space="0" w:sz="0" w:val="nil"/>
+          <w:left w:space="0" w:sz="0" w:val="nil"/>
+          <w:bottom w:space="0" w:sz="0" w:val="nil"/>
+          <w:right w:space="0" w:sz="0" w:val="nil"/>
+          <w:between w:space="0" w:sz="0" w:val="nil"/>
+        </w:pBdr>
+        <w:shd w:fill="auto" w:val="clear"/>
         <w:jc w:val="center"/>
         <w:rPr>
           <w:b w:val="1"/>
@@ -184,10 +196,2337 @@
       </w:pPr>
       <w:r>
         <w:rPr>
+          <w:rtl w:val="0"/>
+        </w:rPr>
+      </w:r>
+    </w:p>
+    <w:p>
+      <w:pPr>
+        <w:jc w:val="center"/>
+        <w:rPr>
           <w:b w:val="1"/>
           <w:sz w:val="24"/>
           <w:szCs w:val="24"/>
           <w:u w:val="single"/>
+        </w:rPr>
+      </w:pPr>
+      <w:r>
+        <w:rPr>
+          <w:b w:val="1"/>
+          <w:sz w:val="24"/>
+          <w:szCs w:val="24"/>
+          <w:u w:val="single"/>
+          <w:rtl w:val="0"/>
+        </w:rPr>
+        <w:t xml:space="preserve">Meeting 6</w:t>
+      </w:r>
+    </w:p>
+    <w:p>
+      <w:pPr>
+        <w:rPr>
+          <w:sz w:val="24"/>
+          <w:szCs w:val="24"/>
+        </w:rPr>
+      </w:pPr>
+      <w:r>
+        <w:rPr>
+          <w:b w:val="1"/>
+          <w:sz w:val="24"/>
+          <w:szCs w:val="24"/>
+          <w:rtl w:val="0"/>
+        </w:rPr>
+        <w:t xml:space="preserve">Date and Time:</w:t>
+      </w:r>
+      <w:r>
+        <w:rPr>
+          <w:sz w:val="24"/>
+          <w:szCs w:val="24"/>
+          <w:rtl w:val="0"/>
+        </w:rPr>
+        <w:t xml:space="preserve">  6/9/2025 6:30 - 7:00</w:t>
+      </w:r>
+    </w:p>
+    <w:p>
+      <w:pPr>
+        <w:rPr>
+          <w:sz w:val="24"/>
+          <w:szCs w:val="24"/>
+        </w:rPr>
+      </w:pPr>
+      <w:r>
+        <w:rPr>
+          <w:b w:val="1"/>
+          <w:sz w:val="24"/>
+          <w:szCs w:val="24"/>
+          <w:rtl w:val="0"/>
+        </w:rPr>
+        <w:t xml:space="preserve">Place</w:t>
+      </w:r>
+      <w:r>
+        <w:rPr>
+          <w:sz w:val="24"/>
+          <w:szCs w:val="24"/>
+          <w:rtl w:val="0"/>
+        </w:rPr>
+        <w:t xml:space="preserve">: Discord voice call</w:t>
+      </w:r>
+    </w:p>
+    <w:p>
+      <w:pPr>
+        <w:rPr>
+          <w:sz w:val="24"/>
+          <w:szCs w:val="24"/>
+        </w:rPr>
+      </w:pPr>
+      <w:r>
+        <w:rPr>
+          <w:b w:val="1"/>
+          <w:sz w:val="24"/>
+          <w:szCs w:val="24"/>
+          <w:rtl w:val="0"/>
+        </w:rPr>
+        <w:t xml:space="preserve">Participants:</w:t>
+      </w:r>
+      <w:r>
+        <w:rPr>
+          <w:sz w:val="24"/>
+          <w:szCs w:val="24"/>
+          <w:rtl w:val="0"/>
+        </w:rPr>
+        <w:t xml:space="preserve"> Grant Hovey, Tetiana Korchynska, Xuelin Min, Iqra Chaudhary, Thomas Iliev, Hongjie Zhang</w:t>
+      </w:r>
+    </w:p>
+    <w:p>
+      <w:pPr>
+        <w:rPr>
+          <w:sz w:val="24"/>
+          <w:szCs w:val="24"/>
+        </w:rPr>
+      </w:pPr>
+      <w:r>
+        <w:rPr>
+          <w:b w:val="1"/>
+          <w:sz w:val="24"/>
+          <w:szCs w:val="24"/>
+          <w:rtl w:val="0"/>
+        </w:rPr>
+        <w:t xml:space="preserve">Minutes taker: </w:t>
+      </w:r>
+      <w:r>
+        <w:rPr>
+          <w:sz w:val="24"/>
+          <w:szCs w:val="24"/>
+          <w:rtl w:val="0"/>
+        </w:rPr>
+        <w:t xml:space="preserve">Xuelin Min</w:t>
+      </w:r>
+    </w:p>
+    <w:p>
+      <w:pPr>
+        <w:rPr>
+          <w:sz w:val="24"/>
+          <w:szCs w:val="24"/>
+        </w:rPr>
+      </w:pPr>
+      <w:r>
+        <w:rPr>
+          <w:b w:val="1"/>
+          <w:sz w:val="24"/>
+          <w:szCs w:val="24"/>
+          <w:rtl w:val="0"/>
+        </w:rPr>
+        <w:t xml:space="preserve">Timekeeper: </w:t>
+      </w:r>
+      <w:r>
+        <w:rPr>
+          <w:sz w:val="24"/>
+          <w:szCs w:val="24"/>
+          <w:rtl w:val="0"/>
+        </w:rPr>
+        <w:t xml:space="preserve">Xuelin Min</w:t>
+      </w:r>
+    </w:p>
+    <w:p>
+      <w:pPr>
+        <w:rPr>
+          <w:sz w:val="24"/>
+          <w:szCs w:val="24"/>
+        </w:rPr>
+      </w:pPr>
+      <w:r>
+        <w:rPr>
+          <w:b w:val="1"/>
+          <w:sz w:val="24"/>
+          <w:szCs w:val="24"/>
+          <w:rtl w:val="0"/>
+        </w:rPr>
+        <w:t xml:space="preserve">Purpose: </w:t>
+      </w:r>
+      <w:r>
+        <w:rPr>
+          <w:sz w:val="24"/>
+          <w:szCs w:val="24"/>
+          <w:rtl w:val="0"/>
+        </w:rPr>
+        <w:t xml:space="preserve">Iteration 2 wrap up and iteration 3</w:t>
+      </w:r>
+    </w:p>
+    <w:p>
+      <w:pPr>
+        <w:rPr>
+          <w:b w:val="1"/>
+          <w:sz w:val="24"/>
+          <w:szCs w:val="24"/>
+        </w:rPr>
+      </w:pPr>
+      <w:r>
+        <w:rPr>
+          <w:rtl w:val="0"/>
+        </w:rPr>
+      </w:r>
+    </w:p>
+    <w:p>
+      <w:pPr>
+        <w:rPr>
+          <w:b w:val="1"/>
+          <w:sz w:val="24"/>
+          <w:szCs w:val="24"/>
+        </w:rPr>
+      </w:pPr>
+      <w:r>
+        <w:rPr>
+          <w:b w:val="1"/>
+          <w:sz w:val="24"/>
+          <w:szCs w:val="24"/>
+          <w:rtl w:val="0"/>
+        </w:rPr>
+        <w:t xml:space="preserve">Agenda: </w:t>
+      </w:r>
+    </w:p>
+    <w:p>
+      <w:pPr>
+        <w:rPr>
+          <w:b w:val="1"/>
+          <w:sz w:val="24"/>
+          <w:szCs w:val="24"/>
+        </w:rPr>
+      </w:pPr>
+      <w:r>
+        <w:rPr>
+          <w:rtl w:val="0"/>
+        </w:rPr>
+      </w:r>
+    </w:p>
+    <w:p>
+      <w:pPr>
+        <w:rPr>
+          <w:sz w:val="24"/>
+          <w:szCs w:val="24"/>
+        </w:rPr>
+      </w:pPr>
+      <w:r>
+        <w:rPr>
+          <w:sz w:val="24"/>
+          <w:szCs w:val="24"/>
+          <w:rtl w:val="0"/>
+        </w:rPr>
+        <w:t xml:space="preserve">Iteration 2</w:t>
+      </w:r>
+    </w:p>
+    <w:p>
+      <w:pPr>
+        <w:numPr>
+          <w:ilvl w:val="0"/>
+          <w:numId w:val="13"/>
+        </w:numPr>
+        <w:ind w:left="720" w:hanging="360"/>
+        <w:rPr>
+          <w:sz w:val="24"/>
+          <w:szCs w:val="24"/>
+        </w:rPr>
+      </w:pPr>
+      <w:r>
+        <w:rPr>
+          <w:sz w:val="24"/>
+          <w:szCs w:val="24"/>
+          <w:rtl w:val="0"/>
+        </w:rPr>
+        <w:t xml:space="preserve">Review completed work and confirm what’s fully done</w:t>
+      </w:r>
+    </w:p>
+    <w:p>
+      <w:pPr>
+        <w:numPr>
+          <w:ilvl w:val="0"/>
+          <w:numId w:val="13"/>
+        </w:numPr>
+        <w:ind w:left="720" w:hanging="360"/>
+        <w:rPr>
+          <w:sz w:val="24"/>
+          <w:szCs w:val="24"/>
+          <w:u w:val="none"/>
+        </w:rPr>
+      </w:pPr>
+      <w:r>
+        <w:rPr>
+          <w:sz w:val="24"/>
+          <w:szCs w:val="24"/>
+          <w:rtl w:val="0"/>
+        </w:rPr>
+        <w:t xml:space="preserve">Share screen and test entire app flow</w:t>
+      </w:r>
+    </w:p>
+    <w:p>
+      <w:pPr>
+        <w:numPr>
+          <w:ilvl w:val="0"/>
+          <w:numId w:val="13"/>
+        </w:numPr>
+        <w:ind w:left="720" w:hanging="360"/>
+        <w:rPr>
+          <w:sz w:val="24"/>
+          <w:szCs w:val="24"/>
+          <w:u w:val="none"/>
+        </w:rPr>
+      </w:pPr>
+      <w:r>
+        <w:rPr>
+          <w:sz w:val="24"/>
+          <w:szCs w:val="24"/>
+          <w:rtl w:val="0"/>
+        </w:rPr>
+        <w:t xml:space="preserve">Ensure all docs are filled out</w:t>
+      </w:r>
+    </w:p>
+    <w:p>
+      <w:pPr>
+        <w:numPr>
+          <w:ilvl w:val="1"/>
+          <w:numId w:val="13"/>
+        </w:numPr>
+        <w:ind w:left="1440" w:hanging="360"/>
+        <w:rPr>
+          <w:sz w:val="24"/>
+          <w:szCs w:val="24"/>
+          <w:u w:val="none"/>
+        </w:rPr>
+      </w:pPr>
+      <w:r>
+        <w:rPr>
+          <w:sz w:val="24"/>
+          <w:szCs w:val="24"/>
+          <w:rtl w:val="0"/>
+        </w:rPr>
+        <w:t xml:space="preserve">Make sure you fill out progress report correctly; if you’re the last person working on it, update the group report timings accordingly</w:t>
+      </w:r>
+    </w:p>
+    <w:p>
+      <w:pPr>
+        <w:numPr>
+          <w:ilvl w:val="0"/>
+          <w:numId w:val="13"/>
+        </w:numPr>
+        <w:ind w:left="720" w:hanging="360"/>
+        <w:rPr>
+          <w:sz w:val="24"/>
+          <w:szCs w:val="24"/>
+          <w:u w:val="none"/>
+        </w:rPr>
+      </w:pPr>
+      <w:r>
+        <w:rPr>
+          <w:sz w:val="24"/>
+          <w:szCs w:val="24"/>
+          <w:rtl w:val="0"/>
+        </w:rPr>
+        <w:t xml:space="preserve">Who is doing the presentation</w:t>
+      </w:r>
+    </w:p>
+    <w:p>
+      <w:pPr>
+        <w:rPr>
+          <w:sz w:val="24"/>
+          <w:szCs w:val="24"/>
+        </w:rPr>
+      </w:pPr>
+      <w:r>
+        <w:rPr>
+          <w:rtl w:val="0"/>
+        </w:rPr>
+      </w:r>
+    </w:p>
+    <w:p>
+      <w:pPr>
+        <w:rPr>
+          <w:sz w:val="24"/>
+          <w:szCs w:val="24"/>
+        </w:rPr>
+      </w:pPr>
+      <w:r>
+        <w:rPr>
+          <w:sz w:val="24"/>
+          <w:szCs w:val="24"/>
+          <w:rtl w:val="0"/>
+        </w:rPr>
+        <w:t xml:space="preserve">Iteration 3</w:t>
+      </w:r>
+    </w:p>
+    <w:p>
+      <w:pPr>
+        <w:numPr>
+          <w:ilvl w:val="0"/>
+          <w:numId w:val="12"/>
+        </w:numPr>
+        <w:ind w:left="720" w:hanging="360"/>
+        <w:rPr>
+          <w:sz w:val="24"/>
+          <w:szCs w:val="24"/>
+          <w:u w:val="none"/>
+        </w:rPr>
+      </w:pPr>
+      <w:r>
+        <w:rPr>
+          <w:sz w:val="24"/>
+          <w:szCs w:val="24"/>
+          <w:rtl w:val="0"/>
+        </w:rPr>
+        <w:t xml:space="preserve">Identify an unfinished or unstarted feature to complete</w:t>
+      </w:r>
+    </w:p>
+    <w:p>
+      <w:pPr>
+        <w:numPr>
+          <w:ilvl w:val="1"/>
+          <w:numId w:val="12"/>
+        </w:numPr>
+        <w:ind w:left="1440" w:hanging="360"/>
+        <w:rPr>
+          <w:sz w:val="24"/>
+          <w:szCs w:val="24"/>
+        </w:rPr>
+      </w:pPr>
+      <w:r>
+        <w:rPr>
+          <w:sz w:val="24"/>
+          <w:szCs w:val="24"/>
+          <w:rtl w:val="0"/>
+        </w:rPr>
+        <w:t xml:space="preserve">Dashboard</w:t>
+      </w:r>
+    </w:p>
+    <w:p>
+      <w:pPr>
+        <w:numPr>
+          <w:ilvl w:val="1"/>
+          <w:numId w:val="12"/>
+        </w:numPr>
+        <w:ind w:left="1440" w:hanging="360"/>
+        <w:rPr>
+          <w:sz w:val="24"/>
+          <w:szCs w:val="24"/>
+          <w:u w:val="none"/>
+        </w:rPr>
+      </w:pPr>
+      <w:r>
+        <w:rPr>
+          <w:sz w:val="24"/>
+          <w:szCs w:val="24"/>
+          <w:rtl w:val="0"/>
+        </w:rPr>
+        <w:t xml:space="preserve">Story Generation - stuck on loading screen</w:t>
+      </w:r>
+    </w:p>
+    <w:p>
+      <w:pPr>
+        <w:numPr>
+          <w:ilvl w:val="1"/>
+          <w:numId w:val="12"/>
+        </w:numPr>
+        <w:ind w:left="1440" w:hanging="360"/>
+        <w:rPr>
+          <w:sz w:val="24"/>
+          <w:szCs w:val="24"/>
+          <w:u w:val="none"/>
+        </w:rPr>
+      </w:pPr>
+      <w:r>
+        <w:rPr>
+          <w:sz w:val="24"/>
+          <w:szCs w:val="24"/>
+          <w:rtl w:val="0"/>
+        </w:rPr>
+        <w:t xml:space="preserve">About/contact not available once signed in</w:t>
+      </w:r>
+    </w:p>
+    <w:p>
+      <w:pPr>
+        <w:numPr>
+          <w:ilvl w:val="1"/>
+          <w:numId w:val="12"/>
+        </w:numPr>
+        <w:ind w:left="1440" w:hanging="360"/>
+        <w:rPr>
+          <w:sz w:val="24"/>
+          <w:szCs w:val="24"/>
+          <w:u w:val="none"/>
+        </w:rPr>
+      </w:pPr>
+      <w:r>
+        <w:rPr>
+          <w:sz w:val="24"/>
+          <w:szCs w:val="24"/>
+          <w:rtl w:val="0"/>
+        </w:rPr>
+        <w:t xml:space="preserve">Sign Up - no errors show up when field left empty or when “@</w:t>
+      </w:r>
+      <w:hyperlink r:id="rId6">
+        <w:r>
+          <w:rPr>
+            <w:color w:val="1155cc"/>
+            <w:sz w:val="24"/>
+            <w:szCs w:val="24"/>
+            <w:u w:val="single"/>
+            <w:rtl w:val="0"/>
+          </w:rPr>
+          <w:t xml:space="preserve">email.com</w:t>
+        </w:r>
+      </w:hyperlink>
+      <w:r>
+        <w:rPr>
+          <w:sz w:val="24"/>
+          <w:szCs w:val="24"/>
+          <w:rtl w:val="0"/>
+        </w:rPr>
+        <w:t xml:space="preserve">” isn’t present</w:t>
+      </w:r>
+    </w:p>
+    <w:p>
+      <w:pPr>
+        <w:numPr>
+          <w:ilvl w:val="1"/>
+          <w:numId w:val="12"/>
+        </w:numPr>
+        <w:ind w:left="1440" w:hanging="360"/>
+        <w:rPr>
+          <w:sz w:val="24"/>
+          <w:szCs w:val="24"/>
+          <w:u w:val="none"/>
+        </w:rPr>
+      </w:pPr>
+      <w:r>
+        <w:rPr>
+          <w:sz w:val="24"/>
+          <w:szCs w:val="24"/>
+          <w:rtl w:val="0"/>
+        </w:rPr>
+        <w:t xml:space="preserve">Sign In - no errors show up when “@</w:t>
+      </w:r>
+      <w:hyperlink r:id="rId7">
+        <w:r>
+          <w:rPr>
+            <w:color w:val="1155cc"/>
+            <w:sz w:val="24"/>
+            <w:szCs w:val="24"/>
+            <w:u w:val="single"/>
+            <w:rtl w:val="0"/>
+          </w:rPr>
+          <w:t xml:space="preserve">email.com</w:t>
+        </w:r>
+      </w:hyperlink>
+      <w:r>
+        <w:rPr>
+          <w:sz w:val="24"/>
+          <w:szCs w:val="24"/>
+          <w:rtl w:val="0"/>
+        </w:rPr>
+        <w:t xml:space="preserve">” isn’t present</w:t>
+      </w:r>
+    </w:p>
+    <w:p>
+      <w:pPr>
+        <w:rPr>
+          <w:sz w:val="24"/>
+          <w:szCs w:val="24"/>
+        </w:rPr>
+      </w:pPr>
+      <w:r>
+        <w:rPr>
+          <w:rtl w:val="0"/>
+        </w:rPr>
+      </w:r>
+    </w:p>
+    <w:p>
+      <w:pPr>
+        <w:rPr>
+          <w:b w:val="1"/>
+          <w:sz w:val="24"/>
+          <w:szCs w:val="24"/>
+        </w:rPr>
+      </w:pPr>
+      <w:r>
+        <w:rPr>
+          <w:b w:val="1"/>
+          <w:sz w:val="24"/>
+          <w:szCs w:val="24"/>
+          <w:rtl w:val="0"/>
+        </w:rPr>
+        <w:t xml:space="preserve">Discussions: </w:t>
+      </w:r>
+    </w:p>
+    <w:p>
+      <w:pPr>
+        <w:numPr>
+          <w:ilvl w:val="0"/>
+          <w:numId w:val="13"/>
+        </w:numPr>
+        <w:ind w:left="720" w:hanging="360"/>
+        <w:rPr>
+          <w:sz w:val="24"/>
+          <w:szCs w:val="24"/>
+        </w:rPr>
+      </w:pPr>
+      <w:r>
+        <w:rPr>
+          <w:sz w:val="24"/>
+          <w:szCs w:val="24"/>
+          <w:rtl w:val="0"/>
+        </w:rPr>
+        <w:t xml:space="preserve">Kanban Board tasks</w:t>
+      </w:r>
+    </w:p>
+    <w:p>
+      <w:pPr>
+        <w:numPr>
+          <w:ilvl w:val="0"/>
+          <w:numId w:val="13"/>
+        </w:numPr>
+        <w:ind w:left="720" w:hanging="360"/>
+        <w:rPr>
+          <w:sz w:val="24"/>
+          <w:szCs w:val="24"/>
+          <w:u w:val="none"/>
+        </w:rPr>
+      </w:pPr>
+      <w:r>
+        <w:rPr>
+          <w:sz w:val="24"/>
+          <w:szCs w:val="24"/>
+          <w:rtl w:val="0"/>
+        </w:rPr>
+        <w:t xml:space="preserve">Complete story generate part on app</w:t>
+      </w:r>
+    </w:p>
+    <w:p>
+      <w:pPr>
+        <w:numPr>
+          <w:ilvl w:val="0"/>
+          <w:numId w:val="13"/>
+        </w:numPr>
+        <w:ind w:left="720" w:hanging="360"/>
+        <w:rPr>
+          <w:sz w:val="24"/>
+          <w:szCs w:val="24"/>
+          <w:u w:val="none"/>
+        </w:rPr>
+      </w:pPr>
+      <w:r>
+        <w:rPr>
+          <w:sz w:val="24"/>
+          <w:szCs w:val="24"/>
+          <w:rtl w:val="0"/>
+        </w:rPr>
+        <w:t xml:space="preserve">Move the link which on the above of the UI</w:t>
+      </w:r>
+    </w:p>
+    <w:p>
+      <w:pPr>
+        <w:numPr>
+          <w:ilvl w:val="0"/>
+          <w:numId w:val="13"/>
+        </w:numPr>
+        <w:ind w:left="720" w:hanging="360"/>
+        <w:rPr>
+          <w:sz w:val="24"/>
+          <w:szCs w:val="24"/>
+          <w:u w:val="none"/>
+        </w:rPr>
+      </w:pPr>
+      <w:r>
+        <w:rPr>
+          <w:sz w:val="24"/>
+          <w:szCs w:val="24"/>
+          <w:rtl w:val="0"/>
+        </w:rPr>
+        <w:t xml:space="preserve">For next iteration, the dash board and my stories will be on the agenda </w:t>
+      </w:r>
+    </w:p>
+    <w:p>
+      <w:pPr>
+        <w:numPr>
+          <w:ilvl w:val="0"/>
+          <w:numId w:val="13"/>
+        </w:numPr>
+        <w:ind w:left="720" w:hanging="360"/>
+        <w:rPr>
+          <w:sz w:val="24"/>
+          <w:szCs w:val="24"/>
+          <w:u w:val="none"/>
+        </w:rPr>
+      </w:pPr>
+      <w:r>
+        <w:rPr>
+          <w:sz w:val="24"/>
+          <w:szCs w:val="24"/>
+          <w:rtl w:val="0"/>
+        </w:rPr>
+        <w:t xml:space="preserve">Add the footer on the bottom of the UI</w:t>
+      </w:r>
+    </w:p>
+    <w:p>
+      <w:pPr>
+        <w:numPr>
+          <w:ilvl w:val="0"/>
+          <w:numId w:val="13"/>
+        </w:numPr>
+        <w:ind w:left="720" w:hanging="360"/>
+        <w:rPr>
+          <w:sz w:val="24"/>
+          <w:szCs w:val="24"/>
+        </w:rPr>
+      </w:pPr>
+      <w:r>
+        <w:rPr>
+          <w:sz w:val="24"/>
+          <w:szCs w:val="24"/>
+          <w:rtl w:val="0"/>
+        </w:rPr>
+        <w:t xml:space="preserve">Review and update key docs:</w:t>
+      </w:r>
+    </w:p>
+    <w:p>
+      <w:pPr>
+        <w:numPr>
+          <w:ilvl w:val="1"/>
+          <w:numId w:val="13"/>
+        </w:numPr>
+        <w:ind w:left="1440" w:hanging="360"/>
+        <w:rPr>
+          <w:sz w:val="24"/>
+          <w:szCs w:val="24"/>
+        </w:rPr>
+      </w:pPr>
+      <w:r>
+        <w:rPr>
+          <w:sz w:val="24"/>
+          <w:szCs w:val="24"/>
+          <w:rtl w:val="0"/>
+        </w:rPr>
+        <w:t xml:space="preserve">STD</w:t>
+      </w:r>
+    </w:p>
+    <w:p>
+      <w:pPr>
+        <w:numPr>
+          <w:ilvl w:val="1"/>
+          <w:numId w:val="13"/>
+        </w:numPr>
+        <w:ind w:left="1440" w:hanging="360"/>
+        <w:rPr>
+          <w:sz w:val="24"/>
+          <w:szCs w:val="24"/>
+        </w:rPr>
+      </w:pPr>
+      <w:r>
+        <w:rPr>
+          <w:sz w:val="24"/>
+          <w:szCs w:val="24"/>
+          <w:rtl w:val="0"/>
+        </w:rPr>
+        <w:t xml:space="preserve">SPPP</w:t>
+      </w:r>
+    </w:p>
+    <w:p>
+      <w:pPr>
+        <w:numPr>
+          <w:ilvl w:val="1"/>
+          <w:numId w:val="13"/>
+        </w:numPr>
+        <w:ind w:left="1440" w:hanging="360"/>
+        <w:rPr>
+          <w:sz w:val="24"/>
+          <w:szCs w:val="24"/>
+        </w:rPr>
+      </w:pPr>
+      <w:r>
+        <w:rPr>
+          <w:sz w:val="24"/>
+          <w:szCs w:val="24"/>
+          <w:rtl w:val="0"/>
+        </w:rPr>
+        <w:t xml:space="preserve">SDD</w:t>
+      </w:r>
+    </w:p>
+    <w:p>
+      <w:pPr>
+        <w:numPr>
+          <w:ilvl w:val="1"/>
+          <w:numId w:val="13"/>
+        </w:numPr>
+        <w:ind w:left="1440" w:hanging="360"/>
+        <w:rPr>
+          <w:sz w:val="24"/>
+          <w:szCs w:val="24"/>
+          <w:u w:val="none"/>
+        </w:rPr>
+      </w:pPr>
+      <w:r>
+        <w:rPr>
+          <w:sz w:val="24"/>
+          <w:szCs w:val="24"/>
+          <w:rtl w:val="0"/>
+        </w:rPr>
+        <w:t xml:space="preserve">Making sure that everyone fill out the Individual Progress Reports</w:t>
+      </w:r>
+    </w:p>
+    <w:p>
+      <w:pPr>
+        <w:numPr>
+          <w:ilvl w:val="0"/>
+          <w:numId w:val="13"/>
+        </w:numPr>
+        <w:ind w:left="720" w:hanging="360"/>
+        <w:rPr>
+          <w:sz w:val="24"/>
+          <w:szCs w:val="24"/>
+          <w:u w:val="none"/>
+        </w:rPr>
+      </w:pPr>
+      <w:r>
+        <w:rPr>
+          <w:rtl w:val="0"/>
+        </w:rPr>
+      </w:r>
+    </w:p>
+    <w:p>
+      <w:pPr>
+        <w:rPr>
+          <w:b w:val="1"/>
+          <w:sz w:val="24"/>
+          <w:szCs w:val="24"/>
+        </w:rPr>
+      </w:pPr>
+      <w:r>
+        <w:rPr>
+          <w:rtl w:val="0"/>
+        </w:rPr>
+      </w:r>
+    </w:p>
+    <w:p>
+      <w:pPr>
+        <w:rPr>
+          <w:b w:val="1"/>
+          <w:sz w:val="24"/>
+          <w:szCs w:val="24"/>
+        </w:rPr>
+      </w:pPr>
+      <w:r>
+        <w:rPr>
+          <w:b w:val="1"/>
+          <w:sz w:val="24"/>
+          <w:szCs w:val="24"/>
+          <w:rtl w:val="0"/>
+        </w:rPr>
+        <w:t xml:space="preserve">Key Decisions:</w:t>
+      </w:r>
+    </w:p>
+    <w:p>
+      <w:pPr>
+        <w:numPr>
+          <w:ilvl w:val="0"/>
+          <w:numId w:val="3"/>
+        </w:numPr>
+        <w:ind w:left="720" w:hanging="360"/>
+        <w:rPr>
+          <w:sz w:val="24"/>
+          <w:szCs w:val="24"/>
+        </w:rPr>
+      </w:pPr>
+      <w:r>
+        <w:rPr>
+          <w:sz w:val="24"/>
+          <w:szCs w:val="24"/>
+          <w:rtl w:val="0"/>
+        </w:rPr>
+        <w:t xml:space="preserve">Start working on the story generate section</w:t>
+      </w:r>
+    </w:p>
+    <w:p>
+      <w:pPr>
+        <w:numPr>
+          <w:ilvl w:val="0"/>
+          <w:numId w:val="3"/>
+        </w:numPr>
+        <w:ind w:left="720" w:hanging="360"/>
+        <w:rPr>
+          <w:sz w:val="24"/>
+          <w:szCs w:val="24"/>
+          <w:u w:val="none"/>
+        </w:rPr>
+      </w:pPr>
+      <w:r>
+        <w:rPr>
+          <w:sz w:val="24"/>
+          <w:szCs w:val="24"/>
+          <w:rtl w:val="0"/>
+        </w:rPr>
+        <w:t xml:space="preserve">Thomas and Xuelin will do the presentation</w:t>
+      </w:r>
+    </w:p>
+    <w:p>
+      <w:pPr>
+        <w:ind w:left="720" w:firstLine="0"/>
+        <w:rPr>
+          <w:sz w:val="24"/>
+          <w:szCs w:val="24"/>
+        </w:rPr>
+      </w:pPr>
+      <w:r>
+        <w:rPr>
+          <w:rtl w:val="0"/>
+        </w:rPr>
+      </w:r>
+    </w:p>
+    <w:p>
+      <w:pPr>
+        <w:rPr>
+          <w:b w:val="1"/>
+          <w:sz w:val="24"/>
+          <w:szCs w:val="24"/>
+        </w:rPr>
+      </w:pPr>
+      <w:r>
+        <w:rPr>
+          <w:b w:val="1"/>
+          <w:sz w:val="24"/>
+          <w:szCs w:val="24"/>
+          <w:rtl w:val="0"/>
+        </w:rPr>
+        <w:t xml:space="preserve">Action Items: </w:t>
+      </w:r>
+    </w:p>
+    <w:p>
+      <w:pPr>
+        <w:rPr>
+          <w:b w:val="1"/>
+          <w:sz w:val="24"/>
+          <w:szCs w:val="24"/>
+        </w:rPr>
+      </w:pPr>
+      <w:r>
+        <w:rPr>
+          <w:rtl w:val="0"/>
+        </w:rPr>
+      </w:r>
+    </w:p>
+    <w:p>
+      <w:pPr>
+        <w:numPr>
+          <w:ilvl w:val="0"/>
+          <w:numId w:val="13"/>
+        </w:numPr>
+        <w:ind w:left="720" w:hanging="360"/>
+        <w:rPr>
+          <w:sz w:val="24"/>
+          <w:szCs w:val="24"/>
+        </w:rPr>
+      </w:pPr>
+      <w:r>
+        <w:rPr>
+          <w:sz w:val="24"/>
+          <w:szCs w:val="24"/>
+          <w:rtl w:val="0"/>
+        </w:rPr>
+        <w:t xml:space="preserve">Review and update STD, SPPP, SDD documents</w:t>
+      </w:r>
+    </w:p>
+    <w:p>
+      <w:pPr>
+        <w:numPr>
+          <w:ilvl w:val="0"/>
+          <w:numId w:val="13"/>
+        </w:numPr>
+        <w:ind w:left="720" w:hanging="360"/>
+        <w:rPr>
+          <w:sz w:val="24"/>
+          <w:szCs w:val="24"/>
+          <w:u w:val="none"/>
+        </w:rPr>
+      </w:pPr>
+      <w:r>
+        <w:rPr>
+          <w:sz w:val="24"/>
+          <w:szCs w:val="24"/>
+          <w:rtl w:val="0"/>
+        </w:rPr>
+        <w:t xml:space="preserve">Update progress report</w:t>
+      </w:r>
+    </w:p>
+    <w:p>
+      <w:pPr>
+        <w:numPr>
+          <w:ilvl w:val="0"/>
+          <w:numId w:val="13"/>
+        </w:numPr>
+        <w:ind w:left="720" w:hanging="360"/>
+        <w:rPr>
+          <w:sz w:val="24"/>
+          <w:szCs w:val="24"/>
+          <w:u w:val="none"/>
+        </w:rPr>
+      </w:pPr>
+      <w:r>
+        <w:rPr>
+          <w:sz w:val="24"/>
+          <w:szCs w:val="24"/>
+          <w:rtl w:val="0"/>
+        </w:rPr>
+        <w:t xml:space="preserve">Start working on the Dash Board and My stories</w:t>
+      </w:r>
+    </w:p>
+    <w:p>
+      <w:pPr>
+        <w:numPr>
+          <w:ilvl w:val="0"/>
+          <w:numId w:val="13"/>
+        </w:numPr>
+        <w:ind w:left="720" w:hanging="360"/>
+        <w:rPr>
+          <w:sz w:val="24"/>
+          <w:szCs w:val="24"/>
+          <w:u w:val="none"/>
+        </w:rPr>
+      </w:pPr>
+      <w:r>
+        <w:rPr>
+          <w:sz w:val="24"/>
+          <w:szCs w:val="24"/>
+          <w:rtl w:val="0"/>
+        </w:rPr>
+        <w:t xml:space="preserve">Remove link and add footers</w:t>
+      </w:r>
+    </w:p>
+    <w:p>
+      <w:pPr>
+        <w:keepNext w:val="0"/>
+        <w:keepLines w:val="0"/>
+        <w:pageBreakBefore w:val="0"/>
+        <w:widowControl w:val="0"/>
+        <w:pBdr>
+          <w:top w:space="0" w:sz="0" w:val="nil"/>
+          <w:left w:space="0" w:sz="0" w:val="nil"/>
+          <w:bottom w:space="0" w:sz="0" w:val="nil"/>
+          <w:right w:space="0" w:sz="0" w:val="nil"/>
+          <w:between w:space="0" w:sz="0" w:val="nil"/>
+        </w:pBdr>
+        <w:shd w:fill="auto" w:val="clear"/>
+        <w:jc w:val="center"/>
+        <w:rPr>
+          <w:b w:val="1"/>
+          <w:sz w:val="24"/>
+          <w:szCs w:val="24"/>
+          <w:u w:val="single"/>
+        </w:rPr>
+      </w:pPr>
+      <w:r>
+        <w:rPr>
+          <w:rtl w:val="0"/>
+        </w:rPr>
+      </w:r>
+    </w:p>
+    <w:p>
+      <w:pPr>
+        <w:keepNext w:val="0"/>
+        <w:keepLines w:val="0"/>
+        <w:pageBreakBefore w:val="0"/>
+        <w:widowControl w:val="0"/>
+        <w:pBdr>
+          <w:top w:space="0" w:sz="0" w:val="nil"/>
+          <w:left w:space="0" w:sz="0" w:val="nil"/>
+          <w:bottom w:space="0" w:sz="0" w:val="nil"/>
+          <w:right w:space="0" w:sz="0" w:val="nil"/>
+          <w:between w:space="0" w:sz="0" w:val="nil"/>
+        </w:pBdr>
+        <w:shd w:fill="auto" w:val="clear"/>
+        <w:jc w:val="center"/>
+        <w:rPr>
+          <w:b w:val="1"/>
+          <w:sz w:val="24"/>
+          <w:szCs w:val="24"/>
+          <w:u w:val="single"/>
+        </w:rPr>
+      </w:pPr>
+      <w:r>
+        <w:rPr>
+          <w:rtl w:val="0"/>
+        </w:rPr>
+      </w:r>
+    </w:p>
+    <w:p>
+      <w:pPr>
+        <w:jc w:val="center"/>
+        <w:rPr>
+          <w:b w:val="1"/>
+          <w:sz w:val="24"/>
+          <w:szCs w:val="24"/>
+          <w:u w:val="single"/>
+        </w:rPr>
+      </w:pPr>
+      <w:r>
+        <w:rPr>
+          <w:b w:val="1"/>
+          <w:sz w:val="24"/>
+          <w:szCs w:val="24"/>
+          <w:u w:val="single"/>
+          <w:rtl w:val="0"/>
+        </w:rPr>
+        <w:t xml:space="preserve">Meeting 5</w:t>
+      </w:r>
+    </w:p>
+    <w:p>
+      <w:pPr>
+        <w:rPr>
+          <w:sz w:val="24"/>
+          <w:szCs w:val="24"/>
+        </w:rPr>
+      </w:pPr>
+      <w:r>
+        <w:rPr>
+          <w:b w:val="1"/>
+          <w:sz w:val="24"/>
+          <w:szCs w:val="24"/>
+          <w:rtl w:val="0"/>
+        </w:rPr>
+        <w:t xml:space="preserve">Date and Time:</w:t>
+      </w:r>
+      <w:r>
+        <w:rPr>
+          <w:sz w:val="24"/>
+          <w:szCs w:val="24"/>
+          <w:rtl w:val="0"/>
+        </w:rPr>
+        <w:t xml:space="preserve">  6/2/2025 6:30- 7:00 pm</w:t>
+      </w:r>
+    </w:p>
+    <w:p>
+      <w:pPr>
+        <w:rPr>
+          <w:sz w:val="24"/>
+          <w:szCs w:val="24"/>
+        </w:rPr>
+      </w:pPr>
+      <w:r>
+        <w:rPr>
+          <w:b w:val="1"/>
+          <w:sz w:val="24"/>
+          <w:szCs w:val="24"/>
+          <w:rtl w:val="0"/>
+        </w:rPr>
+        <w:t xml:space="preserve">Place</w:t>
+      </w:r>
+      <w:r>
+        <w:rPr>
+          <w:sz w:val="24"/>
+          <w:szCs w:val="24"/>
+          <w:rtl w:val="0"/>
+        </w:rPr>
+        <w:t xml:space="preserve">: Discord voice call</w:t>
+      </w:r>
+    </w:p>
+    <w:p>
+      <w:pPr>
+        <w:rPr>
+          <w:sz w:val="24"/>
+          <w:szCs w:val="24"/>
+        </w:rPr>
+      </w:pPr>
+      <w:r>
+        <w:rPr>
+          <w:b w:val="1"/>
+          <w:sz w:val="24"/>
+          <w:szCs w:val="24"/>
+          <w:rtl w:val="0"/>
+        </w:rPr>
+        <w:t xml:space="preserve">Participants:</w:t>
+      </w:r>
+      <w:r>
+        <w:rPr>
+          <w:sz w:val="24"/>
+          <w:szCs w:val="24"/>
+          <w:rtl w:val="0"/>
+        </w:rPr>
+        <w:t xml:space="preserve"> Grant Hovey, Hongjie Zhang, Xuelin Min, Iqra Chaudhary, Thomas Iliev</w:t>
+      </w:r>
+    </w:p>
+    <w:p>
+      <w:pPr>
+        <w:rPr>
+          <w:sz w:val="24"/>
+          <w:szCs w:val="24"/>
+        </w:rPr>
+      </w:pPr>
+      <w:r>
+        <w:rPr>
+          <w:b w:val="1"/>
+          <w:sz w:val="24"/>
+          <w:szCs w:val="24"/>
+          <w:rtl w:val="0"/>
+        </w:rPr>
+        <w:t xml:space="preserve">Minutes taker: </w:t>
+      </w:r>
+      <w:r>
+        <w:rPr>
+          <w:sz w:val="24"/>
+          <w:szCs w:val="24"/>
+          <w:rtl w:val="0"/>
+        </w:rPr>
+        <w:t xml:space="preserve">Hongjie Zhang</w:t>
+      </w:r>
+    </w:p>
+    <w:p>
+      <w:pPr>
+        <w:rPr>
+          <w:sz w:val="24"/>
+          <w:szCs w:val="24"/>
+        </w:rPr>
+      </w:pPr>
+      <w:r>
+        <w:rPr>
+          <w:b w:val="1"/>
+          <w:sz w:val="24"/>
+          <w:szCs w:val="24"/>
+          <w:rtl w:val="0"/>
+        </w:rPr>
+        <w:t xml:space="preserve">Timekeeper: </w:t>
+      </w:r>
+      <w:r>
+        <w:rPr>
+          <w:sz w:val="24"/>
+          <w:szCs w:val="24"/>
+          <w:rtl w:val="0"/>
+        </w:rPr>
+        <w:t xml:space="preserve">Hongjie Zhang</w:t>
+      </w:r>
+    </w:p>
+    <w:p>
+      <w:pPr>
+        <w:rPr>
+          <w:sz w:val="24"/>
+          <w:szCs w:val="24"/>
+        </w:rPr>
+      </w:pPr>
+      <w:r>
+        <w:rPr>
+          <w:b w:val="1"/>
+          <w:sz w:val="24"/>
+          <w:szCs w:val="24"/>
+          <w:rtl w:val="0"/>
+        </w:rPr>
+        <w:t xml:space="preserve">Purpose: </w:t>
+      </w:r>
+      <w:r>
+        <w:rPr>
+          <w:sz w:val="24"/>
+          <w:szCs w:val="24"/>
+          <w:rtl w:val="0"/>
+        </w:rPr>
+        <w:t xml:space="preserve">Iteration 2 and lab 3</w:t>
+      </w:r>
+    </w:p>
+    <w:p>
+      <w:pPr>
+        <w:rPr>
+          <w:b w:val="1"/>
+          <w:sz w:val="24"/>
+          <w:szCs w:val="24"/>
+        </w:rPr>
+      </w:pPr>
+      <w:r>
+        <w:rPr>
+          <w:rtl w:val="0"/>
+        </w:rPr>
+      </w:r>
+    </w:p>
+    <w:p>
+      <w:pPr>
+        <w:rPr>
+          <w:b w:val="1"/>
+          <w:sz w:val="24"/>
+          <w:szCs w:val="24"/>
+        </w:rPr>
+      </w:pPr>
+      <w:r>
+        <w:rPr>
+          <w:b w:val="1"/>
+          <w:sz w:val="24"/>
+          <w:szCs w:val="24"/>
+          <w:rtl w:val="0"/>
+        </w:rPr>
+        <w:t xml:space="preserve">Agenda: </w:t>
+      </w:r>
+    </w:p>
+    <w:p>
+      <w:pPr>
+        <w:numPr>
+          <w:ilvl w:val="0"/>
+          <w:numId w:val="13"/>
+        </w:numPr>
+        <w:ind w:left="720" w:hanging="360"/>
+        <w:rPr>
+          <w:sz w:val="24"/>
+          <w:szCs w:val="24"/>
+        </w:rPr>
+      </w:pPr>
+      <w:r>
+        <w:rPr>
+          <w:sz w:val="24"/>
+          <w:szCs w:val="24"/>
+          <w:rtl w:val="0"/>
+        </w:rPr>
+        <w:t xml:space="preserve">Lab 3 and Quiz 2 due by tomorrow 6 am</w:t>
+      </w:r>
+    </w:p>
+    <w:p>
+      <w:pPr>
+        <w:numPr>
+          <w:ilvl w:val="0"/>
+          <w:numId w:val="13"/>
+        </w:numPr>
+        <w:ind w:left="720" w:hanging="360"/>
+        <w:rPr>
+          <w:sz w:val="24"/>
+          <w:szCs w:val="24"/>
+        </w:rPr>
+      </w:pPr>
+      <w:r>
+        <w:rPr>
+          <w:sz w:val="24"/>
+          <w:szCs w:val="24"/>
+          <w:rtl w:val="0"/>
+        </w:rPr>
+        <w:t xml:space="preserve">Updates - what have you done, what are you working on now, what are you planning to do</w:t>
+      </w:r>
+    </w:p>
+    <w:p>
+      <w:pPr>
+        <w:numPr>
+          <w:ilvl w:val="0"/>
+          <w:numId w:val="13"/>
+        </w:numPr>
+        <w:ind w:left="720" w:hanging="360"/>
+        <w:rPr>
+          <w:sz w:val="24"/>
+          <w:szCs w:val="24"/>
+        </w:rPr>
+      </w:pPr>
+      <w:r>
+        <w:rPr>
+          <w:sz w:val="24"/>
+          <w:szCs w:val="24"/>
+          <w:rtl w:val="0"/>
+        </w:rPr>
+        <w:t xml:space="preserve">Review and update key docs:</w:t>
+      </w:r>
+    </w:p>
+    <w:p>
+      <w:pPr>
+        <w:numPr>
+          <w:ilvl w:val="1"/>
+          <w:numId w:val="13"/>
+        </w:numPr>
+        <w:ind w:left="1440" w:hanging="360"/>
+        <w:rPr>
+          <w:sz w:val="24"/>
+          <w:szCs w:val="24"/>
+          <w:u w:val="none"/>
+        </w:rPr>
+      </w:pPr>
+      <w:r>
+        <w:rPr>
+          <w:sz w:val="24"/>
+          <w:szCs w:val="24"/>
+          <w:rtl w:val="0"/>
+        </w:rPr>
+        <w:t xml:space="preserve">STD</w:t>
+      </w:r>
+    </w:p>
+    <w:p>
+      <w:pPr>
+        <w:numPr>
+          <w:ilvl w:val="1"/>
+          <w:numId w:val="13"/>
+        </w:numPr>
+        <w:ind w:left="1440" w:hanging="360"/>
+        <w:rPr>
+          <w:sz w:val="24"/>
+          <w:szCs w:val="24"/>
+          <w:u w:val="none"/>
+        </w:rPr>
+      </w:pPr>
+      <w:r>
+        <w:rPr>
+          <w:sz w:val="24"/>
+          <w:szCs w:val="24"/>
+          <w:rtl w:val="0"/>
+        </w:rPr>
+        <w:t xml:space="preserve">SPPP</w:t>
+      </w:r>
+    </w:p>
+    <w:p>
+      <w:pPr>
+        <w:numPr>
+          <w:ilvl w:val="1"/>
+          <w:numId w:val="13"/>
+        </w:numPr>
+        <w:ind w:left="1440" w:hanging="360"/>
+        <w:rPr>
+          <w:sz w:val="24"/>
+          <w:szCs w:val="24"/>
+          <w:u w:val="none"/>
+        </w:rPr>
+      </w:pPr>
+      <w:r>
+        <w:rPr>
+          <w:sz w:val="24"/>
+          <w:szCs w:val="24"/>
+          <w:rtl w:val="0"/>
+        </w:rPr>
+        <w:t xml:space="preserve">SDD</w:t>
+      </w:r>
+    </w:p>
+    <w:p>
+      <w:pPr>
+        <w:numPr>
+          <w:ilvl w:val="1"/>
+          <w:numId w:val="13"/>
+        </w:numPr>
+        <w:ind w:left="1440" w:hanging="360"/>
+        <w:rPr>
+          <w:sz w:val="24"/>
+          <w:szCs w:val="24"/>
+          <w:u w:val="none"/>
+        </w:rPr>
+      </w:pPr>
+      <w:r>
+        <w:rPr>
+          <w:sz w:val="24"/>
+          <w:szCs w:val="24"/>
+          <w:rtl w:val="0"/>
+        </w:rPr>
+        <w:t xml:space="preserve">Individual Progress Reports - make sure you’re filling it out correctly. Keep up with it throughout the week if you know you won’t be able to complete it in time Monday night.</w:t>
+      </w:r>
+    </w:p>
+    <w:p>
+      <w:pPr>
+        <w:numPr>
+          <w:ilvl w:val="0"/>
+          <w:numId w:val="13"/>
+        </w:numPr>
+        <w:ind w:left="720" w:hanging="360"/>
+        <w:rPr>
+          <w:sz w:val="24"/>
+          <w:szCs w:val="24"/>
+          <w:u w:val="none"/>
+        </w:rPr>
+      </w:pPr>
+      <w:r>
+        <w:rPr>
+          <w:sz w:val="24"/>
+          <w:szCs w:val="24"/>
+          <w:rtl w:val="0"/>
+        </w:rPr>
+        <w:t xml:space="preserve">Continue implementing and testing</w:t>
+      </w:r>
+    </w:p>
+    <w:p>
+      <w:pPr>
+        <w:numPr>
+          <w:ilvl w:val="1"/>
+          <w:numId w:val="13"/>
+        </w:numPr>
+        <w:ind w:left="1440" w:hanging="360"/>
+        <w:rPr>
+          <w:sz w:val="24"/>
+          <w:szCs w:val="24"/>
+          <w:u w:val="none"/>
+        </w:rPr>
+      </w:pPr>
+      <w:r>
+        <w:rPr>
+          <w:sz w:val="24"/>
+          <w:szCs w:val="24"/>
+          <w:rtl w:val="0"/>
+        </w:rPr>
+        <w:t xml:space="preserve">Story Generation</w:t>
+      </w:r>
+    </w:p>
+    <w:p>
+      <w:pPr>
+        <w:numPr>
+          <w:ilvl w:val="0"/>
+          <w:numId w:val="13"/>
+        </w:numPr>
+        <w:ind w:left="720" w:hanging="360"/>
+        <w:rPr>
+          <w:sz w:val="24"/>
+          <w:szCs w:val="24"/>
+          <w:u w:val="none"/>
+        </w:rPr>
+      </w:pPr>
+      <w:r>
+        <w:rPr>
+          <w:sz w:val="24"/>
+          <w:szCs w:val="24"/>
+          <w:rtl w:val="0"/>
+        </w:rPr>
+        <w:t xml:space="preserve">Reminder:</w:t>
+      </w:r>
+    </w:p>
+    <w:p>
+      <w:pPr>
+        <w:numPr>
+          <w:ilvl w:val="1"/>
+          <w:numId w:val="13"/>
+        </w:numPr>
+        <w:ind w:left="1440" w:hanging="360"/>
+        <w:rPr>
+          <w:sz w:val="24"/>
+          <w:szCs w:val="24"/>
+          <w:u w:val="none"/>
+        </w:rPr>
+      </w:pPr>
+      <w:r>
+        <w:rPr>
+          <w:sz w:val="24"/>
+          <w:szCs w:val="24"/>
+          <w:rtl w:val="0"/>
+        </w:rPr>
+        <w:t xml:space="preserve">Work on tasks gradually throughout the week. Don’t leave everything for Monday. The team depends on consistent progress.</w:t>
+      </w:r>
+    </w:p>
+    <w:p>
+      <w:pPr>
+        <w:numPr>
+          <w:ilvl w:val="1"/>
+          <w:numId w:val="13"/>
+        </w:numPr>
+        <w:ind w:left="1440" w:hanging="360"/>
+        <w:rPr>
+          <w:sz w:val="24"/>
+          <w:szCs w:val="24"/>
+          <w:u w:val="none"/>
+        </w:rPr>
+      </w:pPr>
+      <w:r>
+        <w:rPr>
+          <w:sz w:val="24"/>
+          <w:szCs w:val="24"/>
+          <w:rtl w:val="0"/>
+        </w:rPr>
+        <w:t xml:space="preserve">COMMUNICATE - if you’re not going to make it to a meeting, let us know. If you’re unable to finish something, or can’t start something on time, let us know. Don’t leave your team hanging.</w:t>
+      </w:r>
+    </w:p>
+    <w:p>
+      <w:pPr>
+        <w:rPr>
+          <w:b w:val="1"/>
+          <w:sz w:val="24"/>
+          <w:szCs w:val="24"/>
+        </w:rPr>
+      </w:pPr>
+      <w:r>
+        <w:rPr>
+          <w:b w:val="1"/>
+          <w:sz w:val="24"/>
+          <w:szCs w:val="24"/>
+          <w:rtl w:val="0"/>
+        </w:rPr>
+        <w:t xml:space="preserve">Discussions: </w:t>
+      </w:r>
+    </w:p>
+    <w:p>
+      <w:pPr>
+        <w:numPr>
+          <w:ilvl w:val="0"/>
+          <w:numId w:val="9"/>
+        </w:numPr>
+        <w:ind w:left="720" w:hanging="360"/>
+        <w:rPr>
+          <w:sz w:val="24"/>
+          <w:szCs w:val="24"/>
+        </w:rPr>
+      </w:pPr>
+      <w:r>
+        <w:rPr>
+          <w:sz w:val="24"/>
+          <w:szCs w:val="24"/>
+          <w:rtl w:val="0"/>
+        </w:rPr>
+        <w:t xml:space="preserve">Status update</w:t>
+      </w:r>
+      <w:r>
+        <w:rPr>
+          <w:rtl w:val="0"/>
+        </w:rPr>
+      </w:r>
+    </w:p>
+    <w:p>
+      <w:pPr>
+        <w:numPr>
+          <w:ilvl w:val="0"/>
+          <w:numId w:val="13"/>
+        </w:numPr>
+        <w:ind w:left="720" w:hanging="360"/>
+        <w:rPr>
+          <w:sz w:val="24"/>
+          <w:szCs w:val="24"/>
+        </w:rPr>
+      </w:pPr>
+      <w:r>
+        <w:rPr>
+          <w:sz w:val="24"/>
+          <w:szCs w:val="24"/>
+          <w:rtl w:val="0"/>
+        </w:rPr>
+        <w:t xml:space="preserve">REMINDER: Working on Quiz2 and Lab3</w:t>
+      </w:r>
+    </w:p>
+    <w:p>
+      <w:pPr>
+        <w:numPr>
+          <w:ilvl w:val="0"/>
+          <w:numId w:val="13"/>
+        </w:numPr>
+        <w:ind w:left="720" w:hanging="360"/>
+        <w:rPr>
+          <w:sz w:val="24"/>
+          <w:szCs w:val="24"/>
+        </w:rPr>
+      </w:pPr>
+      <w:r>
+        <w:rPr>
+          <w:sz w:val="24"/>
+          <w:szCs w:val="24"/>
+          <w:rtl w:val="0"/>
+        </w:rPr>
+        <w:t xml:space="preserve">Iteration 2 </w:t>
+      </w:r>
+    </w:p>
+    <w:p>
+      <w:pPr>
+        <w:numPr>
+          <w:ilvl w:val="1"/>
+          <w:numId w:val="13"/>
+        </w:numPr>
+        <w:ind w:left="1440" w:hanging="360"/>
+        <w:rPr>
+          <w:sz w:val="24"/>
+          <w:szCs w:val="24"/>
+        </w:rPr>
+      </w:pPr>
+      <w:r>
+        <w:rPr>
+          <w:sz w:val="24"/>
+          <w:szCs w:val="24"/>
+          <w:rtl w:val="0"/>
+        </w:rPr>
+        <w:t xml:space="preserve">Story Generation</w:t>
+      </w:r>
+    </w:p>
+    <w:p>
+      <w:pPr>
+        <w:numPr>
+          <w:ilvl w:val="1"/>
+          <w:numId w:val="13"/>
+        </w:numPr>
+        <w:spacing w:after="0" w:afterAutospacing="0"/>
+        <w:ind w:left="1440" w:hanging="360"/>
+        <w:rPr>
+          <w:sz w:val="24"/>
+          <w:szCs w:val="24"/>
+        </w:rPr>
+      </w:pPr>
+      <w:r>
+        <w:rPr>
+          <w:sz w:val="24"/>
+          <w:szCs w:val="24"/>
+          <w:rtl w:val="0"/>
+        </w:rPr>
+        <w:t xml:space="preserve">Story reading page in the frontend</w:t>
+      </w:r>
+    </w:p>
+    <w:p>
+      <w:pPr>
+        <w:numPr>
+          <w:ilvl w:val="1"/>
+          <w:numId w:val="13"/>
+        </w:numPr>
+        <w:spacing w:after="0" w:afterAutospacing="0" w:before="0" w:beforeAutospacing="0" w:lineRule="auto"/>
+        <w:ind w:left="1440" w:hanging="360"/>
+        <w:rPr>
+          <w:sz w:val="24"/>
+          <w:szCs w:val="24"/>
+        </w:rPr>
+      </w:pPr>
+      <w:r>
+        <w:rPr>
+          <w:sz w:val="24"/>
+          <w:szCs w:val="24"/>
+          <w:rtl w:val="0"/>
+        </w:rPr>
+        <w:t xml:space="preserve">Text-to-speech functionality</w:t>
+      </w:r>
+    </w:p>
+    <w:p>
+      <w:pPr>
+        <w:numPr>
+          <w:ilvl w:val="1"/>
+          <w:numId w:val="13"/>
+        </w:numPr>
+        <w:ind w:left="1440" w:hanging="360"/>
+        <w:rPr>
+          <w:sz w:val="24"/>
+          <w:szCs w:val="24"/>
+        </w:rPr>
+      </w:pPr>
+      <w:r>
+        <w:rPr>
+          <w:sz w:val="24"/>
+          <w:szCs w:val="24"/>
+          <w:rtl w:val="0"/>
+        </w:rPr>
+        <w:t xml:space="preserve">Text highlighting functionality</w:t>
+      </w:r>
+    </w:p>
+    <w:p>
+      <w:pPr>
+        <w:spacing w:after="240" w:before="240" w:lineRule="auto"/>
+        <w:ind w:left="1440" w:firstLine="0"/>
+        <w:rPr>
+          <w:sz w:val="24"/>
+          <w:szCs w:val="24"/>
+        </w:rPr>
+      </w:pPr>
+      <w:r>
+        <w:rPr>
+          <w:rtl w:val="0"/>
+        </w:rPr>
+      </w:r>
+    </w:p>
+    <w:p>
+      <w:pPr>
+        <w:numPr>
+          <w:ilvl w:val="0"/>
+          <w:numId w:val="13"/>
+        </w:numPr>
+        <w:ind w:left="720" w:hanging="360"/>
+        <w:rPr>
+          <w:sz w:val="24"/>
+          <w:szCs w:val="24"/>
+          <w:u w:val="none"/>
+        </w:rPr>
+      </w:pPr>
+      <w:r>
+        <w:rPr>
+          <w:sz w:val="24"/>
+          <w:szCs w:val="24"/>
+          <w:rtl w:val="0"/>
+        </w:rPr>
+        <w:t xml:space="preserve">Need Thomas to work on Frontend(React testing library)/Backend(Jest/supertest) Testing</w:t>
+      </w:r>
+    </w:p>
+    <w:p>
+      <w:pPr>
+        <w:numPr>
+          <w:ilvl w:val="0"/>
+          <w:numId w:val="13"/>
+        </w:numPr>
+        <w:spacing w:after="0" w:afterAutospacing="0"/>
+        <w:ind w:left="720" w:hanging="360"/>
+        <w:rPr>
+          <w:sz w:val="24"/>
+          <w:szCs w:val="24"/>
+          <w:u w:val="none"/>
+        </w:rPr>
+      </w:pPr>
+      <w:r>
+        <w:rPr>
+          <w:sz w:val="24"/>
+          <w:szCs w:val="24"/>
+          <w:rtl w:val="0"/>
+        </w:rPr>
+        <w:t xml:space="preserve">REMINDER: Review and update STD, SPPP, SDD documents</w:t>
+      </w:r>
+    </w:p>
+    <w:p>
+      <w:pPr>
+        <w:numPr>
+          <w:ilvl w:val="0"/>
+          <w:numId w:val="13"/>
+        </w:numPr>
+        <w:spacing w:after="0" w:afterAutospacing="0" w:before="0" w:beforeAutospacing="0" w:lineRule="auto"/>
+        <w:ind w:left="720" w:hanging="360"/>
+        <w:rPr>
+          <w:sz w:val="24"/>
+          <w:szCs w:val="24"/>
+        </w:rPr>
+      </w:pPr>
+      <w:r>
+        <w:rPr>
+          <w:sz w:val="24"/>
+          <w:szCs w:val="24"/>
+          <w:rtl w:val="0"/>
+        </w:rPr>
+        <w:t xml:space="preserve">Encouraging Thomas to prioritize frontend/backend testing</w:t>
+      </w:r>
+    </w:p>
+    <w:p>
+      <w:pPr>
+        <w:numPr>
+          <w:ilvl w:val="0"/>
+          <w:numId w:val="13"/>
+        </w:numPr>
+        <w:ind w:left="720" w:hanging="360"/>
+        <w:rPr>
+          <w:sz w:val="24"/>
+          <w:szCs w:val="24"/>
+        </w:rPr>
+      </w:pPr>
+      <w:r>
+        <w:rPr>
+          <w:sz w:val="24"/>
+          <w:szCs w:val="24"/>
+          <w:rtl w:val="0"/>
+        </w:rPr>
+        <w:t xml:space="preserve">Need someone to record the presentation for iteration 2</w:t>
+      </w:r>
+    </w:p>
+    <w:p>
+      <w:pPr>
+        <w:numPr>
+          <w:ilvl w:val="0"/>
+          <w:numId w:val="13"/>
+        </w:numPr>
+        <w:ind w:left="720" w:hanging="360"/>
+        <w:rPr>
+          <w:sz w:val="24"/>
+          <w:szCs w:val="24"/>
+          <w:u w:val="none"/>
+        </w:rPr>
+      </w:pPr>
+      <w:r>
+        <w:rPr>
+          <w:sz w:val="24"/>
+          <w:szCs w:val="24"/>
+          <w:rtl w:val="0"/>
+        </w:rPr>
+        <w:t xml:space="preserve">REMINDER: Increase GitHub PR and commit frequency</w:t>
+      </w:r>
+    </w:p>
+    <w:p>
+      <w:pPr>
+        <w:numPr>
+          <w:ilvl w:val="0"/>
+          <w:numId w:val="13"/>
+        </w:numPr>
+        <w:ind w:left="720" w:hanging="360"/>
+        <w:rPr>
+          <w:sz w:val="24"/>
+          <w:szCs w:val="24"/>
+          <w:u w:val="none"/>
+        </w:rPr>
+      </w:pPr>
+      <w:r>
+        <w:rPr>
+          <w:sz w:val="24"/>
+          <w:szCs w:val="24"/>
+          <w:rtl w:val="0"/>
+        </w:rPr>
+        <w:t xml:space="preserve">REMINDER: Ensure hour accuracy on the progress report</w:t>
+      </w:r>
+    </w:p>
+    <w:p>
+      <w:pPr>
+        <w:numPr>
+          <w:ilvl w:val="0"/>
+          <w:numId w:val="13"/>
+        </w:numPr>
+        <w:ind w:left="720" w:hanging="360"/>
+        <w:rPr>
+          <w:sz w:val="24"/>
+          <w:szCs w:val="24"/>
+          <w:u w:val="none"/>
+        </w:rPr>
+      </w:pPr>
+      <w:r>
+        <w:rPr>
+          <w:sz w:val="24"/>
+          <w:szCs w:val="24"/>
+          <w:rtl w:val="0"/>
+        </w:rPr>
+        <w:t xml:space="preserve">REMINDER: Reinforced the importance of proactive communication</w:t>
+      </w:r>
+    </w:p>
+    <w:p>
+      <w:pPr>
+        <w:rPr>
+          <w:b w:val="1"/>
+          <w:sz w:val="24"/>
+          <w:szCs w:val="24"/>
+        </w:rPr>
+      </w:pPr>
+      <w:r>
+        <w:rPr>
+          <w:rtl w:val="0"/>
+        </w:rPr>
+      </w:r>
+    </w:p>
+    <w:p>
+      <w:pPr>
+        <w:rPr>
+          <w:b w:val="1"/>
+          <w:sz w:val="24"/>
+          <w:szCs w:val="24"/>
+        </w:rPr>
+      </w:pPr>
+      <w:r>
+        <w:rPr>
+          <w:b w:val="1"/>
+          <w:sz w:val="24"/>
+          <w:szCs w:val="24"/>
+          <w:rtl w:val="0"/>
+        </w:rPr>
+        <w:t xml:space="preserve">Key Decisions:</w:t>
+      </w:r>
+    </w:p>
+    <w:p>
+      <w:pPr>
+        <w:numPr>
+          <w:ilvl w:val="0"/>
+          <w:numId w:val="3"/>
+        </w:numPr>
+        <w:ind w:left="720" w:hanging="360"/>
+        <w:rPr>
+          <w:sz w:val="24"/>
+          <w:szCs w:val="24"/>
+        </w:rPr>
+      </w:pPr>
+      <w:r>
+        <w:rPr>
+          <w:sz w:val="24"/>
+          <w:szCs w:val="24"/>
+          <w:rtl w:val="0"/>
+        </w:rPr>
+        <w:t xml:space="preserve">Thomas will be responsible for writing all testing code (both frontend and backend) - Zach will assist Thomas with testing issues when needed</w:t>
+      </w:r>
+    </w:p>
+    <w:p>
+      <w:pPr>
+        <w:numPr>
+          <w:ilvl w:val="0"/>
+          <w:numId w:val="3"/>
+        </w:numPr>
+        <w:ind w:left="720" w:hanging="360"/>
+        <w:rPr>
+          <w:sz w:val="24"/>
+          <w:szCs w:val="24"/>
+          <w:u w:val="none"/>
+        </w:rPr>
+      </w:pPr>
+      <w:r>
+        <w:rPr>
+          <w:sz w:val="24"/>
+          <w:szCs w:val="24"/>
+          <w:rtl w:val="0"/>
+        </w:rPr>
+        <w:t xml:space="preserve">The frontend reading page must be completed before text-to-speech and text highlighting features can be finalized</w:t>
+      </w:r>
+    </w:p>
+    <w:p>
+      <w:pPr>
+        <w:rPr>
+          <w:b w:val="1"/>
+          <w:sz w:val="24"/>
+          <w:szCs w:val="24"/>
+        </w:rPr>
+      </w:pPr>
+      <w:r>
+        <w:rPr>
+          <w:b w:val="1"/>
+          <w:sz w:val="24"/>
+          <w:szCs w:val="24"/>
+          <w:rtl w:val="0"/>
+        </w:rPr>
+        <w:t xml:space="preserve">Action Items: </w:t>
+      </w:r>
+    </w:p>
+    <w:p>
+      <w:pPr>
+        <w:rPr>
+          <w:b w:val="1"/>
+          <w:sz w:val="24"/>
+          <w:szCs w:val="24"/>
+        </w:rPr>
+      </w:pPr>
+      <w:r>
+        <w:rPr>
+          <w:rtl w:val="0"/>
+        </w:rPr>
+      </w:r>
+    </w:p>
+    <w:p>
+      <w:pPr>
+        <w:numPr>
+          <w:ilvl w:val="0"/>
+          <w:numId w:val="13"/>
+        </w:numPr>
+        <w:ind w:left="720" w:hanging="360"/>
+        <w:rPr>
+          <w:sz w:val="24"/>
+          <w:szCs w:val="24"/>
+        </w:rPr>
+      </w:pPr>
+      <w:r>
+        <w:rPr>
+          <w:sz w:val="24"/>
+          <w:szCs w:val="24"/>
+          <w:rtl w:val="0"/>
+        </w:rPr>
+        <w:t xml:space="preserve">Complete Quiz 2</w:t>
+      </w:r>
+    </w:p>
+    <w:p>
+      <w:pPr>
+        <w:numPr>
+          <w:ilvl w:val="0"/>
+          <w:numId w:val="13"/>
+        </w:numPr>
+        <w:ind w:left="720" w:hanging="360"/>
+        <w:rPr>
+          <w:sz w:val="24"/>
+          <w:szCs w:val="24"/>
+        </w:rPr>
+      </w:pPr>
+      <w:r>
+        <w:rPr>
+          <w:sz w:val="24"/>
+          <w:szCs w:val="24"/>
+          <w:rtl w:val="0"/>
+        </w:rPr>
+        <w:t xml:space="preserve">Complete Lab 3</w:t>
+      </w:r>
+    </w:p>
+    <w:p>
+      <w:pPr>
+        <w:numPr>
+          <w:ilvl w:val="0"/>
+          <w:numId w:val="13"/>
+        </w:numPr>
+        <w:ind w:left="720" w:hanging="360"/>
+        <w:rPr>
+          <w:sz w:val="24"/>
+          <w:szCs w:val="24"/>
+        </w:rPr>
+      </w:pPr>
+      <w:r>
+        <w:rPr>
+          <w:sz w:val="24"/>
+          <w:szCs w:val="24"/>
+          <w:rtl w:val="0"/>
+        </w:rPr>
+        <w:t xml:space="preserve">Take on new tasks in Kanban board and submit additional GitHub PRs</w:t>
+      </w:r>
+    </w:p>
+    <w:p>
+      <w:pPr>
+        <w:numPr>
+          <w:ilvl w:val="0"/>
+          <w:numId w:val="13"/>
+        </w:numPr>
+        <w:ind w:left="720" w:hanging="360"/>
+        <w:rPr>
+          <w:sz w:val="24"/>
+          <w:szCs w:val="24"/>
+        </w:rPr>
+      </w:pPr>
+      <w:r>
+        <w:rPr>
+          <w:sz w:val="24"/>
+          <w:szCs w:val="24"/>
+          <w:rtl w:val="0"/>
+        </w:rPr>
+        <w:t xml:space="preserve">Review and update STD, SPPP, SDD documents</w:t>
+      </w:r>
+    </w:p>
+    <w:p>
+      <w:pPr>
+        <w:numPr>
+          <w:ilvl w:val="0"/>
+          <w:numId w:val="13"/>
+        </w:numPr>
+        <w:ind w:left="720" w:hanging="360"/>
+        <w:rPr>
+          <w:sz w:val="24"/>
+          <w:szCs w:val="24"/>
+          <w:u w:val="none"/>
+        </w:rPr>
+      </w:pPr>
+      <w:r>
+        <w:rPr>
+          <w:sz w:val="24"/>
+          <w:szCs w:val="24"/>
+          <w:rtl w:val="0"/>
+        </w:rPr>
+        <w:t xml:space="preserve">Work on the progress report (Verify hours are correctly entered in the progress reports)</w:t>
+      </w:r>
+    </w:p>
+    <w:p>
+      <w:pPr>
+        <w:numPr>
+          <w:ilvl w:val="0"/>
+          <w:numId w:val="13"/>
+        </w:numPr>
+        <w:ind w:left="720" w:hanging="360"/>
+        <w:rPr>
+          <w:sz w:val="24"/>
+          <w:szCs w:val="24"/>
+          <w:u w:val="none"/>
+        </w:rPr>
+      </w:pPr>
+      <w:r>
+        <w:rPr>
+          <w:sz w:val="24"/>
+          <w:szCs w:val="24"/>
+          <w:rtl w:val="0"/>
+        </w:rPr>
+        <w:t xml:space="preserve">Thomas: Write frontend and backend testing code</w:t>
+      </w:r>
+    </w:p>
+    <w:p>
+      <w:pPr>
+        <w:numPr>
+          <w:ilvl w:val="0"/>
+          <w:numId w:val="13"/>
+        </w:numPr>
+        <w:spacing w:after="0" w:afterAutospacing="0"/>
+        <w:ind w:left="720" w:hanging="360"/>
+        <w:rPr>
+          <w:sz w:val="24"/>
+          <w:szCs w:val="24"/>
+          <w:u w:val="none"/>
+        </w:rPr>
+      </w:pPr>
+      <w:r>
+        <w:rPr>
+          <w:sz w:val="24"/>
+          <w:szCs w:val="24"/>
+          <w:rtl w:val="0"/>
+        </w:rPr>
+        <w:t xml:space="preserve">Tetiana: Complete the story reading page in the frontend.</w:t>
+      </w:r>
+    </w:p>
+    <w:p>
+      <w:pPr>
+        <w:numPr>
+          <w:ilvl w:val="0"/>
+          <w:numId w:val="13"/>
+        </w:numPr>
+        <w:spacing w:after="0" w:afterAutospacing="0" w:before="0" w:beforeAutospacing="0" w:lineRule="auto"/>
+        <w:ind w:left="720" w:hanging="360"/>
+        <w:rPr>
+          <w:sz w:val="24"/>
+          <w:szCs w:val="24"/>
+        </w:rPr>
+      </w:pPr>
+      <w:r>
+        <w:rPr>
+          <w:sz w:val="24"/>
+          <w:szCs w:val="24"/>
+          <w:rtl w:val="0"/>
+        </w:rPr>
+        <w:t xml:space="preserve">Zach: Assist Thomas with testing if needed</w:t>
+      </w:r>
+    </w:p>
+    <w:p>
+      <w:pPr>
+        <w:numPr>
+          <w:ilvl w:val="0"/>
+          <w:numId w:val="13"/>
+        </w:numPr>
+        <w:spacing w:after="0" w:afterAutospacing="0" w:before="0" w:beforeAutospacing="0" w:lineRule="auto"/>
+        <w:ind w:left="720" w:hanging="360"/>
+        <w:rPr>
+          <w:sz w:val="24"/>
+          <w:szCs w:val="24"/>
+        </w:rPr>
+      </w:pPr>
+      <w:r>
+        <w:rPr>
+          <w:sz w:val="24"/>
+          <w:szCs w:val="24"/>
+          <w:rtl w:val="0"/>
+        </w:rPr>
+        <w:t xml:space="preserve">Zach: Complete text-to-speech functionality</w:t>
+      </w:r>
+    </w:p>
+    <w:p>
+      <w:pPr>
+        <w:numPr>
+          <w:ilvl w:val="0"/>
+          <w:numId w:val="13"/>
+        </w:numPr>
+        <w:ind w:left="720" w:hanging="360"/>
+        <w:rPr>
+          <w:sz w:val="24"/>
+          <w:szCs w:val="24"/>
+        </w:rPr>
+      </w:pPr>
+      <w:r>
+        <w:rPr>
+          <w:sz w:val="24"/>
+          <w:szCs w:val="24"/>
+          <w:rtl w:val="0"/>
+        </w:rPr>
+        <w:t xml:space="preserve">Zach: Complete text highlighting functionality</w:t>
+      </w:r>
+    </w:p>
+    <w:p>
+      <w:pPr>
+        <w:ind w:left="720" w:firstLine="0"/>
+        <w:rPr>
+          <w:sz w:val="24"/>
+          <w:szCs w:val="24"/>
+        </w:rPr>
+      </w:pPr>
+      <w:r>
+        <w:rPr>
+          <w:rtl w:val="0"/>
+        </w:rPr>
+      </w:r>
+    </w:p>
+    <w:p>
+      <w:pPr>
+        <w:rPr>
+          <w:b w:val="1"/>
+          <w:sz w:val="24"/>
+          <w:szCs w:val="24"/>
+        </w:rPr>
+      </w:pPr>
+      <w:r>
+        <w:rPr>
+          <w:rtl w:val="0"/>
+        </w:rPr>
+      </w:r>
+    </w:p>
+    <w:p>
+      <w:pPr>
+        <w:keepNext w:val="0"/>
+        <w:keepLines w:val="0"/>
+        <w:pageBreakBefore w:val="0"/>
+        <w:widowControl w:val="0"/>
+        <w:pBdr>
+          <w:top w:space="0" w:sz="0" w:val="nil"/>
+          <w:left w:space="0" w:sz="0" w:val="nil"/>
+          <w:bottom w:space="0" w:sz="0" w:val="nil"/>
+          <w:right w:space="0" w:sz="0" w:val="nil"/>
+          <w:between w:space="0" w:sz="0" w:val="nil"/>
+        </w:pBdr>
+        <w:shd w:fill="auto" w:val="clear"/>
+        <w:jc w:val="center"/>
+        <w:rPr>
+          <w:b w:val="1"/>
+          <w:sz w:val="24"/>
+          <w:szCs w:val="24"/>
+          <w:u w:val="single"/>
+        </w:rPr>
+      </w:pPr>
+      <w:r>
+        <w:rPr>
+          <w:rtl w:val="0"/>
+        </w:rPr>
+      </w:r>
+    </w:p>
+    <w:p>
+      <w:pPr>
+        <w:keepNext w:val="0"/>
+        <w:keepLines w:val="0"/>
+        <w:pageBreakBefore w:val="0"/>
+        <w:widowControl w:val="0"/>
+        <w:pBdr>
+          <w:top w:space="0" w:sz="0" w:val="nil"/>
+          <w:left w:space="0" w:sz="0" w:val="nil"/>
+          <w:bottom w:space="0" w:sz="0" w:val="nil"/>
+          <w:right w:space="0" w:sz="0" w:val="nil"/>
+          <w:between w:space="0" w:sz="0" w:val="nil"/>
+        </w:pBdr>
+        <w:shd w:fill="auto" w:val="clear"/>
+        <w:jc w:val="center"/>
+        <w:rPr>
+          <w:b w:val="1"/>
+          <w:sz w:val="24"/>
+          <w:szCs w:val="24"/>
+          <w:u w:val="single"/>
+        </w:rPr>
+      </w:pPr>
+      <w:r>
+        <w:rPr>
+          <w:rtl w:val="0"/>
+        </w:rPr>
+      </w:r>
+    </w:p>
+    <w:p>
+      <w:pPr>
+        <w:keepNext w:val="0"/>
+        <w:keepLines w:val="0"/>
+        <w:pageBreakBefore w:val="0"/>
+        <w:widowControl w:val="0"/>
+        <w:pBdr>
+          <w:top w:space="0" w:sz="0" w:val="nil"/>
+          <w:left w:space="0" w:sz="0" w:val="nil"/>
+          <w:bottom w:space="0" w:sz="0" w:val="nil"/>
+          <w:right w:space="0" w:sz="0" w:val="nil"/>
+          <w:between w:space="0" w:sz="0" w:val="nil"/>
+        </w:pBdr>
+        <w:shd w:fill="auto" w:val="clear"/>
+        <w:jc w:val="center"/>
+        <w:rPr>
+          <w:b w:val="1"/>
+          <w:sz w:val="24"/>
+          <w:szCs w:val="24"/>
+          <w:u w:val="single"/>
+        </w:rPr>
+      </w:pPr>
+      <w:r>
+        <w:rPr>
+          <w:rtl w:val="0"/>
+        </w:rPr>
+      </w:r>
+    </w:p>
+    <w:p>
+      <w:pPr>
+        <w:jc w:val="center"/>
+        <w:rPr>
+          <w:b w:val="1"/>
+          <w:sz w:val="24"/>
+          <w:szCs w:val="24"/>
+          <w:u w:val="single"/>
+        </w:rPr>
+      </w:pPr>
+      <w:r>
+        <w:rPr>
+          <w:b w:val="1"/>
+          <w:sz w:val="24"/>
+          <w:szCs w:val="24"/>
+          <w:u w:val="single"/>
           <w:rtl w:val="0"/>
         </w:rPr>
         <w:t xml:space="preserve">Meeting 4</w:t>
@@ -459,7 +2798,7 @@
           <w:szCs w:val="24"/>
           <w:rtl w:val="0"/>
         </w:rPr>
-        <w:t xml:space="preserve">Who will do presentation</w:t>
+        <w:t xml:space="preserve">Who will do the presentation</w:t>
       </w:r>
     </w:p>
     <w:p>
@@ -644,7 +2983,7 @@
       <w:pPr>
         <w:numPr>
           <w:ilvl w:val="0"/>
-          <w:numId w:val="12"/>
+          <w:numId w:val="13"/>
         </w:numPr>
         <w:ind w:left="720" w:hanging="360"/>
         <w:rPr>
@@ -666,7 +3005,7 @@
       <w:pPr>
         <w:numPr>
           <w:ilvl w:val="0"/>
-          <w:numId w:val="12"/>
+          <w:numId w:val="13"/>
         </w:numPr>
         <w:ind w:left="720" w:hanging="360"/>
         <w:rPr>
@@ -688,7 +3027,7 @@
       <w:pPr>
         <w:numPr>
           <w:ilvl w:val="0"/>
-          <w:numId w:val="12"/>
+          <w:numId w:val="13"/>
         </w:numPr>
         <w:ind w:left="720" w:hanging="360"/>
         <w:rPr>
@@ -710,7 +3049,7 @@
       <w:pPr>
         <w:numPr>
           <w:ilvl w:val="0"/>
-          <w:numId w:val="12"/>
+          <w:numId w:val="13"/>
         </w:numPr>
         <w:ind w:left="720" w:hanging="360"/>
         <w:rPr>
@@ -732,7 +3071,7 @@
       <w:pPr>
         <w:numPr>
           <w:ilvl w:val="0"/>
-          <w:numId w:val="12"/>
+          <w:numId w:val="13"/>
         </w:numPr>
         <w:ind w:left="720" w:hanging="360"/>
         <w:rPr>
@@ -754,7 +3093,7 @@
       <w:pPr>
         <w:numPr>
           <w:ilvl w:val="0"/>
-          <w:numId w:val="12"/>
+          <w:numId w:val="13"/>
         </w:numPr>
         <w:ind w:left="720" w:hanging="360"/>
         <w:rPr>
@@ -776,7 +3115,7 @@
       <w:pPr>
         <w:numPr>
           <w:ilvl w:val="0"/>
-          <w:numId w:val="12"/>
+          <w:numId w:val="13"/>
         </w:numPr>
         <w:ind w:left="720" w:hanging="360"/>
         <w:rPr>
@@ -9741,6 +12080,116 @@
     </w:lvl>
   </w:abstractNum>
   <w:abstractNum w:abstractNumId="12">
+    <w:lvl w:ilvl="0">
+      <w:start w:val="1"/>
+      <w:numFmt w:val="bullet"/>
+      <w:lvlText w:val="●"/>
+      <w:lvlJc w:val="left"/>
+      <w:pPr>
+        <w:ind w:left="720" w:hanging="360"/>
+      </w:pPr>
+      <w:rPr>
+        <w:u w:val="none"/>
+      </w:rPr>
+    </w:lvl>
+    <w:lvl w:ilvl="1">
+      <w:start w:val="1"/>
+      <w:numFmt w:val="bullet"/>
+      <w:lvlText w:val="○"/>
+      <w:lvlJc w:val="left"/>
+      <w:pPr>
+        <w:ind w:left="1440" w:hanging="360"/>
+      </w:pPr>
+      <w:rPr>
+        <w:u w:val="none"/>
+      </w:rPr>
+    </w:lvl>
+    <w:lvl w:ilvl="2">
+      <w:start w:val="1"/>
+      <w:numFmt w:val="bullet"/>
+      <w:lvlText w:val="■"/>
+      <w:lvlJc w:val="left"/>
+      <w:pPr>
+        <w:ind w:left="2160" w:hanging="360"/>
+      </w:pPr>
+      <w:rPr>
+        <w:u w:val="none"/>
+      </w:rPr>
+    </w:lvl>
+    <w:lvl w:ilvl="3">
+      <w:start w:val="1"/>
+      <w:numFmt w:val="bullet"/>
+      <w:lvlText w:val="●"/>
+      <w:lvlJc w:val="left"/>
+      <w:pPr>
+        <w:ind w:left="2880" w:hanging="360"/>
+      </w:pPr>
+      <w:rPr>
+        <w:u w:val="none"/>
+      </w:rPr>
+    </w:lvl>
+    <w:lvl w:ilvl="4">
+      <w:start w:val="1"/>
+      <w:numFmt w:val="bullet"/>
+      <w:lvlText w:val="○"/>
+      <w:lvlJc w:val="left"/>
+      <w:pPr>
+        <w:ind w:left="3600" w:hanging="360"/>
+      </w:pPr>
+      <w:rPr>
+        <w:u w:val="none"/>
+      </w:rPr>
+    </w:lvl>
+    <w:lvl w:ilvl="5">
+      <w:start w:val="1"/>
+      <w:numFmt w:val="bullet"/>
+      <w:lvlText w:val="■"/>
+      <w:lvlJc w:val="left"/>
+      <w:pPr>
+        <w:ind w:left="4320" w:hanging="360"/>
+      </w:pPr>
+      <w:rPr>
+        <w:u w:val="none"/>
+      </w:rPr>
+    </w:lvl>
+    <w:lvl w:ilvl="6">
+      <w:start w:val="1"/>
+      <w:numFmt w:val="bullet"/>
+      <w:lvlText w:val="●"/>
+      <w:lvlJc w:val="left"/>
+      <w:pPr>
+        <w:ind w:left="5040" w:hanging="360"/>
+      </w:pPr>
+      <w:rPr>
+        <w:u w:val="none"/>
+      </w:rPr>
+    </w:lvl>
+    <w:lvl w:ilvl="7">
+      <w:start w:val="1"/>
+      <w:numFmt w:val="bullet"/>
+      <w:lvlText w:val="○"/>
+      <w:lvlJc w:val="left"/>
+      <w:pPr>
+        <w:ind w:left="5760" w:hanging="360"/>
+      </w:pPr>
+      <w:rPr>
+        <w:u w:val="none"/>
+      </w:rPr>
+    </w:lvl>
+    <w:lvl w:ilvl="8">
+      <w:start w:val="1"/>
+      <w:numFmt w:val="bullet"/>
+      <w:lvlText w:val="■"/>
+      <w:lvlJc w:val="left"/>
+      <w:pPr>
+        <w:ind w:left="6480" w:hanging="360"/>
+      </w:pPr>
+      <w:rPr>
+        <w:u w:val="none"/>
+      </w:rPr>
+    </w:lvl>
+  </w:abstractNum>
+  <w:abstractNum w:abstractNumId="13">
     <w:lvl w:ilvl="0">
       <w:start w:val="1"/>
       <w:numFmt w:val="bullet"/>
@@ -9886,6 +12335,9 @@
   <w:num w:numId="12">
     <w:abstractNumId w:val="12"/>
   </w:num>
+  <w:num w:numId="13">
+    <w:abstractNumId w:val="13"/>
+  </w:num>
 </w:numbering>
 </file>
 
@@ -9911,7 +12363,7 @@
     <w:name w:val="normal"/>
   </w:style>
   <w:style w:type="table" w:styleId="TableNormal" w:default="1">
-    <w:name w:val="Table Normal"/>
+    <w:name w:val="TableNormal"/>
   </w:style>
   <w:style w:type="paragraph" w:styleId="Heading1">
     <w:name w:val="heading 1"/>

</xml_diff>